<commit_message>
feat: fix map flex-reverse scrollbar absolute line rendering bug, unlock all preview levels with full description details, and upgrade checkin progress visual dynamic cards & fonts
</commit_message>
<xml_diff>
--- a/慈心大挑戰_部署與資料庫規劃指南.docx
+++ b/慈心大挑戰_部署與資料庫規劃指南.docx
@@ -1776,7 +1776,6 @@
       <w:pPr>
         <w:spacing w:after="240" w:line="300" w:lineRule="auto"/>
         <w:rPr>
-          <w:rFonts w:hint="eastAsia"/>
           <w:lang w:eastAsia="zh-TW"/>
         </w:rPr>
       </w:pPr>
@@ -2175,9 +2174,357 @@
     </w:p>
     <w:p>
       <w:pPr>
+        <w:numPr>
+          <w:ilvl w:val="0"/>
+          <w:numId w:val="10"/>
+        </w:numPr>
         <w:spacing w:after="240" w:line="300" w:lineRule="auto"/>
         <w:rPr>
           <w:rFonts w:hint="eastAsia"/>
+          <w:lang w:eastAsia="zh-TW"/>
+        </w:rPr>
+      </w:pPr>
+      <w:r>
+        <w:rPr>
+          <w:lang w:eastAsia="zh-TW"/>
+        </w:rPr>
+        <w:t>實時「影響夥伴」社會影響力與「減碳具體里程換算卡」</w:t>
+      </w:r>
+    </w:p>
+    <w:p>
+      <w:pPr>
+        <w:numPr>
+          <w:ilvl w:val="0"/>
+          <w:numId w:val="11"/>
+        </w:numPr>
+        <w:spacing w:after="240" w:line="300" w:lineRule="auto"/>
+        <w:rPr>
+          <w:lang w:eastAsia="zh-TW"/>
+        </w:rPr>
+      </w:pPr>
+      <w:r>
+        <w:rPr>
+          <w:b/>
+          <w:bCs/>
+          <w:lang w:eastAsia="zh-TW"/>
+        </w:rPr>
+        <w:t>影響夥伴（不再是死數字）</w:t>
+      </w:r>
+      <w:r>
+        <w:rPr>
+          <w:lang w:eastAsia="zh-TW"/>
+        </w:rPr>
+        <w:t>：</w:t>
+      </w:r>
+    </w:p>
+    <w:p>
+      <w:pPr>
+        <w:numPr>
+          <w:ilvl w:val="1"/>
+          <w:numId w:val="11"/>
+        </w:numPr>
+        <w:spacing w:after="240" w:line="300" w:lineRule="auto"/>
+        <w:rPr>
+          <w:lang w:eastAsia="zh-TW"/>
+        </w:rPr>
+      </w:pPr>
+      <w:r>
+        <w:rPr>
+          <w:lang w:eastAsia="zh-TW"/>
+        </w:rPr>
+        <w:t>現在「影響夥伴」完全</w:t>
+      </w:r>
+      <w:r>
+        <w:rPr>
+          <w:b/>
+          <w:bCs/>
+          <w:lang w:eastAsia="zh-TW"/>
+        </w:rPr>
+        <w:t>與</w:t>
+      </w:r>
+      <w:r>
+        <w:rPr>
+          <w:b/>
+          <w:bCs/>
+          <w:lang w:eastAsia="zh-TW"/>
+        </w:rPr>
+        <w:t xml:space="preserve"> </w:t>
+      </w:r>
+      <w:proofErr w:type="spellStart"/>
+      <w:r>
+        <w:rPr>
+          <w:b/>
+          <w:bCs/>
+          <w:lang w:eastAsia="zh-TW"/>
+        </w:rPr>
+        <w:t>Firestore</w:t>
+      </w:r>
+      <w:proofErr w:type="spellEnd"/>
+      <w:r>
+        <w:rPr>
+          <w:b/>
+          <w:bCs/>
+          <w:lang w:eastAsia="zh-TW"/>
+        </w:rPr>
+        <w:t xml:space="preserve"> </w:t>
+      </w:r>
+      <w:r>
+        <w:rPr>
+          <w:b/>
+          <w:bCs/>
+          <w:lang w:eastAsia="zh-TW"/>
+        </w:rPr>
+        <w:t>社群資料庫動態掛鉤</w:t>
+      </w:r>
+      <w:r>
+        <w:rPr>
+          <w:lang w:eastAsia="zh-TW"/>
+        </w:rPr>
+        <w:t>！</w:t>
+      </w:r>
+    </w:p>
+    <w:p>
+      <w:pPr>
+        <w:numPr>
+          <w:ilvl w:val="1"/>
+          <w:numId w:val="11"/>
+        </w:numPr>
+        <w:spacing w:after="240" w:line="300" w:lineRule="auto"/>
+        <w:rPr>
+          <w:lang w:eastAsia="zh-TW"/>
+        </w:rPr>
+      </w:pPr>
+      <w:r>
+        <w:rPr>
+          <w:lang w:eastAsia="zh-TW"/>
+        </w:rPr>
+        <w:t>我們使用公式實時計算：</w:t>
+      </w:r>
+      <w:r>
+        <w:rPr>
+          <w:lang w:eastAsia="zh-TW"/>
+        </w:rPr>
+        <w:t>(</w:t>
+      </w:r>
+      <w:r>
+        <w:rPr>
+          <w:lang w:eastAsia="zh-TW"/>
+        </w:rPr>
+        <w:t>打卡次數</w:t>
+      </w:r>
+      <w:r>
+        <w:rPr>
+          <w:lang w:eastAsia="zh-TW"/>
+        </w:rPr>
+        <w:t xml:space="preserve"> × 3) + </w:t>
+      </w:r>
+      <w:r>
+        <w:rPr>
+          <w:lang w:eastAsia="zh-TW"/>
+        </w:rPr>
+        <w:t>獲得愛心數</w:t>
+      </w:r>
+      <w:r>
+        <w:rPr>
+          <w:lang w:eastAsia="zh-TW"/>
+        </w:rPr>
+        <w:t xml:space="preserve"> + </w:t>
+      </w:r>
+      <w:r>
+        <w:rPr>
+          <w:lang w:eastAsia="zh-TW"/>
+        </w:rPr>
+        <w:t>不重複留言互動人數。只要有夥伴給你的打卡按讚或留言，這個數據就會即時跳動，真正感受自己的「影響力」！</w:t>
+      </w:r>
+    </w:p>
+    <w:p>
+      <w:pPr>
+        <w:numPr>
+          <w:ilvl w:val="0"/>
+          <w:numId w:val="11"/>
+        </w:numPr>
+        <w:spacing w:after="240" w:line="300" w:lineRule="auto"/>
+        <w:rPr>
+          <w:lang w:eastAsia="zh-TW"/>
+        </w:rPr>
+      </w:pPr>
+      <w:r>
+        <w:rPr>
+          <w:b/>
+          <w:bCs/>
+          <w:lang w:eastAsia="zh-TW"/>
+        </w:rPr>
+        <w:t>減碳成果換算卡（讓數字更溫暖）</w:t>
+      </w:r>
+      <w:r>
+        <w:rPr>
+          <w:lang w:eastAsia="zh-TW"/>
+        </w:rPr>
+        <w:t>：</w:t>
+      </w:r>
+    </w:p>
+    <w:p>
+      <w:pPr>
+        <w:numPr>
+          <w:ilvl w:val="1"/>
+          <w:numId w:val="11"/>
+        </w:numPr>
+        <w:spacing w:after="240" w:line="300" w:lineRule="auto"/>
+        <w:rPr>
+          <w:lang w:eastAsia="zh-TW"/>
+        </w:rPr>
+      </w:pPr>
+      <w:r>
+        <w:rPr>
+          <w:lang w:eastAsia="zh-TW"/>
+        </w:rPr>
+        <w:t>當玩家累積了減碳量，在數據看板下方會動態浮現精緻的提示卡：</w:t>
+      </w:r>
+    </w:p>
+    <w:p>
+      <w:pPr>
+        <w:numPr>
+          <w:ilvl w:val="2"/>
+          <w:numId w:val="11"/>
+        </w:numPr>
+        <w:spacing w:after="240" w:line="300" w:lineRule="auto"/>
+        <w:rPr>
+          <w:lang w:eastAsia="zh-TW"/>
+        </w:rPr>
+      </w:pPr>
+      <w:r>
+        <w:rPr>
+          <w:rFonts w:ascii="Apple Color Emoji" w:hAnsi="Apple Color Emoji" w:cs="Apple Color Emoji"/>
+          <w:lang w:eastAsia="zh-TW"/>
+        </w:rPr>
+        <w:t>🌲</w:t>
+      </w:r>
+      <w:r>
+        <w:rPr>
+          <w:lang w:eastAsia="zh-TW"/>
+        </w:rPr>
+        <w:t xml:space="preserve"> </w:t>
+      </w:r>
+      <w:r>
+        <w:rPr>
+          <w:lang w:eastAsia="zh-TW"/>
+        </w:rPr>
+        <w:t>將</w:t>
+      </w:r>
+      <w:r>
+        <w:rPr>
+          <w:lang w:eastAsia="zh-TW"/>
+        </w:rPr>
+        <w:t xml:space="preserve"> KG </w:t>
+      </w:r>
+      <w:r>
+        <w:rPr>
+          <w:lang w:eastAsia="zh-TW"/>
+        </w:rPr>
+        <w:t>換算成</w:t>
+      </w:r>
+      <w:r>
+        <w:rPr>
+          <w:lang w:eastAsia="zh-TW"/>
+        </w:rPr>
+        <w:t>**</w:t>
+      </w:r>
+      <w:r>
+        <w:rPr>
+          <w:lang w:eastAsia="zh-TW"/>
+        </w:rPr>
+        <w:t>「相當於幾棵樹一整年的吸碳量」</w:t>
+      </w:r>
+      <w:r>
+        <w:rPr>
+          <w:lang w:eastAsia="zh-TW"/>
+        </w:rPr>
+        <w:t>**</w:t>
+      </w:r>
+      <w:r>
+        <w:rPr>
+          <w:lang w:eastAsia="zh-TW"/>
+        </w:rPr>
+        <w:t>！</w:t>
+      </w:r>
+    </w:p>
+    <w:p>
+      <w:pPr>
+        <w:numPr>
+          <w:ilvl w:val="2"/>
+          <w:numId w:val="11"/>
+        </w:numPr>
+        <w:spacing w:after="240" w:line="300" w:lineRule="auto"/>
+        <w:rPr>
+          <w:lang w:eastAsia="zh-TW"/>
+        </w:rPr>
+      </w:pPr>
+      <w:r>
+        <w:rPr>
+          <w:rFonts w:ascii="Apple Color Emoji" w:hAnsi="Apple Color Emoji" w:cs="Apple Color Emoji"/>
+          <w:lang w:eastAsia="zh-TW"/>
+        </w:rPr>
+        <w:t>🚗</w:t>
+      </w:r>
+      <w:r>
+        <w:rPr>
+          <w:lang w:eastAsia="zh-TW"/>
+        </w:rPr>
+        <w:t xml:space="preserve"> </w:t>
+      </w:r>
+      <w:r>
+        <w:rPr>
+          <w:lang w:eastAsia="zh-TW"/>
+        </w:rPr>
+        <w:t>換算成</w:t>
+      </w:r>
+      <w:r>
+        <w:rPr>
+          <w:lang w:eastAsia="zh-TW"/>
+        </w:rPr>
+        <w:t>**</w:t>
+      </w:r>
+      <w:r>
+        <w:rPr>
+          <w:lang w:eastAsia="zh-TW"/>
+        </w:rPr>
+        <w:t>「相當於減少開燃油車行駛了幾公里」</w:t>
+      </w:r>
+      <w:r>
+        <w:rPr>
+          <w:lang w:eastAsia="zh-TW"/>
+        </w:rPr>
+        <w:t>**</w:t>
+      </w:r>
+      <w:r>
+        <w:rPr>
+          <w:lang w:eastAsia="zh-TW"/>
+        </w:rPr>
+        <w:t>！</w:t>
+      </w:r>
+    </w:p>
+    <w:p>
+      <w:pPr>
+        <w:numPr>
+          <w:ilvl w:val="1"/>
+          <w:numId w:val="11"/>
+        </w:numPr>
+        <w:spacing w:after="240" w:line="300" w:lineRule="auto"/>
+        <w:rPr>
+          <w:lang w:eastAsia="zh-TW"/>
+        </w:rPr>
+      </w:pPr>
+      <w:r>
+        <w:rPr>
+          <w:lang w:eastAsia="zh-TW"/>
+        </w:rPr>
+        <w:t>讓長輩一眼看清自己「少用一個塑膠袋、多吃一餐素食」為地球做出的巨大具體貢獻！</w:t>
+      </w:r>
+    </w:p>
+    <w:p>
+      <w:pPr>
+        <w:spacing w:after="240" w:line="300" w:lineRule="auto"/>
+        <w:rPr>
           <w:lang w:eastAsia="zh-TW"/>
         </w:rPr>
       </w:pPr>
@@ -2479,6 +2826,155 @@
     </w:lvl>
   </w:abstractNum>
   <w:abstractNum w:abstractNumId="9" w15:restartNumberingAfterBreak="0">
+    <w:nsid w:val="32C973AA"/>
+    <w:multiLevelType w:val="multilevel"/>
+    <w:tmpl w:val="30FEF65C"/>
+    <w:lvl w:ilvl="0">
+      <w:start w:val="1"/>
+      <w:numFmt w:val="bullet"/>
+      <w:lvlText w:val=""/>
+      <w:lvlJc w:val="left"/>
+      <w:pPr>
+        <w:tabs>
+          <w:tab w:val="num" w:pos="720"/>
+        </w:tabs>
+        <w:ind w:left="720" w:hanging="360"/>
+      </w:pPr>
+      <w:rPr>
+        <w:rFonts w:ascii="Symbol" w:hAnsi="Symbol" w:hint="default"/>
+        <w:sz w:val="20"/>
+      </w:rPr>
+    </w:lvl>
+    <w:lvl w:ilvl="1">
+      <w:start w:val="1"/>
+      <w:numFmt w:val="bullet"/>
+      <w:lvlText w:val=""/>
+      <w:lvlJc w:val="left"/>
+      <w:pPr>
+        <w:tabs>
+          <w:tab w:val="num" w:pos="1440"/>
+        </w:tabs>
+        <w:ind w:left="1440" w:hanging="360"/>
+      </w:pPr>
+      <w:rPr>
+        <w:rFonts w:ascii="Symbol" w:hAnsi="Symbol" w:hint="default"/>
+        <w:sz w:val="20"/>
+      </w:rPr>
+    </w:lvl>
+    <w:lvl w:ilvl="2">
+      <w:start w:val="1"/>
+      <w:numFmt w:val="bullet"/>
+      <w:lvlText w:val=""/>
+      <w:lvlJc w:val="left"/>
+      <w:pPr>
+        <w:tabs>
+          <w:tab w:val="num" w:pos="2160"/>
+        </w:tabs>
+        <w:ind w:left="2160" w:hanging="360"/>
+      </w:pPr>
+      <w:rPr>
+        <w:rFonts w:ascii="Symbol" w:hAnsi="Symbol" w:hint="default"/>
+        <w:sz w:val="20"/>
+      </w:rPr>
+    </w:lvl>
+    <w:lvl w:ilvl="3" w:tentative="1">
+      <w:start w:val="1"/>
+      <w:numFmt w:val="bullet"/>
+      <w:lvlText w:val=""/>
+      <w:lvlJc w:val="left"/>
+      <w:pPr>
+        <w:tabs>
+          <w:tab w:val="num" w:pos="2880"/>
+        </w:tabs>
+        <w:ind w:left="2880" w:hanging="360"/>
+      </w:pPr>
+      <w:rPr>
+        <w:rFonts w:ascii="Symbol" w:hAnsi="Symbol" w:hint="default"/>
+        <w:sz w:val="20"/>
+      </w:rPr>
+    </w:lvl>
+    <w:lvl w:ilvl="4" w:tentative="1">
+      <w:start w:val="1"/>
+      <w:numFmt w:val="bullet"/>
+      <w:lvlText w:val=""/>
+      <w:lvlJc w:val="left"/>
+      <w:pPr>
+        <w:tabs>
+          <w:tab w:val="num" w:pos="3600"/>
+        </w:tabs>
+        <w:ind w:left="3600" w:hanging="360"/>
+      </w:pPr>
+      <w:rPr>
+        <w:rFonts w:ascii="Symbol" w:hAnsi="Symbol" w:hint="default"/>
+        <w:sz w:val="20"/>
+      </w:rPr>
+    </w:lvl>
+    <w:lvl w:ilvl="5" w:tentative="1">
+      <w:start w:val="1"/>
+      <w:numFmt w:val="bullet"/>
+      <w:lvlText w:val=""/>
+      <w:lvlJc w:val="left"/>
+      <w:pPr>
+        <w:tabs>
+          <w:tab w:val="num" w:pos="4320"/>
+        </w:tabs>
+        <w:ind w:left="4320" w:hanging="360"/>
+      </w:pPr>
+      <w:rPr>
+        <w:rFonts w:ascii="Symbol" w:hAnsi="Symbol" w:hint="default"/>
+        <w:sz w:val="20"/>
+      </w:rPr>
+    </w:lvl>
+    <w:lvl w:ilvl="6" w:tentative="1">
+      <w:start w:val="1"/>
+      <w:numFmt w:val="bullet"/>
+      <w:lvlText w:val=""/>
+      <w:lvlJc w:val="left"/>
+      <w:pPr>
+        <w:tabs>
+          <w:tab w:val="num" w:pos="5040"/>
+        </w:tabs>
+        <w:ind w:left="5040" w:hanging="360"/>
+      </w:pPr>
+      <w:rPr>
+        <w:rFonts w:ascii="Symbol" w:hAnsi="Symbol" w:hint="default"/>
+        <w:sz w:val="20"/>
+      </w:rPr>
+    </w:lvl>
+    <w:lvl w:ilvl="7" w:tentative="1">
+      <w:start w:val="1"/>
+      <w:numFmt w:val="bullet"/>
+      <w:lvlText w:val=""/>
+      <w:lvlJc w:val="left"/>
+      <w:pPr>
+        <w:tabs>
+          <w:tab w:val="num" w:pos="5760"/>
+        </w:tabs>
+        <w:ind w:left="5760" w:hanging="360"/>
+      </w:pPr>
+      <w:rPr>
+        <w:rFonts w:ascii="Symbol" w:hAnsi="Symbol" w:hint="default"/>
+        <w:sz w:val="20"/>
+      </w:rPr>
+    </w:lvl>
+    <w:lvl w:ilvl="8" w:tentative="1">
+      <w:start w:val="1"/>
+      <w:numFmt w:val="bullet"/>
+      <w:lvlText w:val=""/>
+      <w:lvlJc w:val="left"/>
+      <w:pPr>
+        <w:tabs>
+          <w:tab w:val="num" w:pos="6480"/>
+        </w:tabs>
+        <w:ind w:left="6480" w:hanging="360"/>
+      </w:pPr>
+      <w:rPr>
+        <w:rFonts w:ascii="Symbol" w:hAnsi="Symbol" w:hint="default"/>
+        <w:sz w:val="20"/>
+      </w:rPr>
+    </w:lvl>
+  </w:abstractNum>
+  <w:abstractNum w:abstractNumId="10" w15:restartNumberingAfterBreak="0">
     <w:nsid w:val="6A244619"/>
     <w:multiLevelType w:val="multilevel"/>
     <w:tmpl w:val="D5BAF1EE"/>
@@ -2623,6 +3119,9 @@
     <w:abstractNumId w:val="0"/>
   </w:num>
   <w:num w:numId="10" w16cid:durableId="1572695704">
+    <w:abstractNumId w:val="10"/>
+  </w:num>
+  <w:num w:numId="11" w16cid:durableId="1660036012">
     <w:abstractNumId w:val="9"/>
   </w:num>
 </w:numbering>

</xml_diff>